<commit_message>
docs: cap nhat nghiep vu cho phep bac si tu dang ky ca truc toi da 3 ca va cap nhat thoi gian thuc
</commit_message>
<xml_diff>
--- a/NghiepVu_DatLich_PhanLich.docx
+++ b/NghiepVu_DatLich_PhanLich.docx
@@ -95,7 +95,7 @@
           <w:color w:val="000000"/>
           <w:sz w:val="26"/>
         </w:rPr>
-        <w:t>1. Nghiệp vụ Phân lịch khám bác sĩ (Doctor Scheduling Workflow):</w:t>
+        <w:t>1. Nghiệp vụ Đăng ký &amp; Phân lịch khám bác sĩ (Doctor Self-Scheduling Workflow):</w:t>
       </w:r>
     </w:p>
     <w:p>
@@ -121,7 +121,7 @@
           <w:color w:val="000000"/>
           <w:sz w:val="26"/>
         </w:rPr>
-        <w:t>Quản lý lịch trực, phòng trực của từng bác sĩ theo từng ngày cụ thể để phục vụ việc khám bệnh tại chỗ và đặt lịch trực tuyến.</w:t>
+        <w:t>Quản lý ca trực, phòng khám của các bác sĩ theo từng ngày, cho phép bác sĩ chủ động đăng ký lịch làm việc phù hợp với thời gian cá nhân của họ và hiển thị công khai lịch trực.</w:t>
       </w:r>
     </w:p>
     <w:p>
@@ -147,77 +147,111 @@
           <w:color w:val="000000"/>
           <w:sz w:val="26"/>
         </w:rPr>
-        <w:t>Admin hoặc Nhân sự quản lý phòng khám.</w:t>
-      </w:r>
-    </w:p>
-    <w:p>
-      <w:pPr>
-        <w:rPr>
-          <w:rFonts w:ascii="Times New Roman" w:hAnsi="Times New Roman" w:cs="Times New Roman"/>
-          <w:b/>
-          <w:color w:val="000000"/>
-          <w:sz w:val="26"/>
-        </w:rPr>
-      </w:pPr>
-      <w:r>
-        <w:rPr>
-          <w:rFonts w:ascii="Times New Roman" w:hAnsi="Times New Roman" w:cs="Times New Roman"/>
-          <w:b/>
-          <w:color w:val="000000"/>
-          <w:sz w:val="26"/>
-        </w:rPr>
-        <w:t xml:space="preserve"> - Quy tắc nghiệp vụ (Business Rules):</w:t>
-      </w:r>
-    </w:p>
-    <w:p>
-      <w:pPr>
-        <w:rPr>
-          <w:rFonts w:ascii="Times New Roman" w:hAnsi="Times New Roman" w:cs="Times New Roman"/>
-          <w:color w:val="000000"/>
-          <w:sz w:val="26"/>
-        </w:rPr>
-      </w:pPr>
-      <w:r>
-        <w:rPr>
-          <w:rFonts w:ascii="Times New Roman" w:hAnsi="Times New Roman" w:cs="Times New Roman"/>
-          <w:color w:val="000000"/>
-          <w:sz w:val="26"/>
-        </w:rPr>
-        <w:t xml:space="preserve">   + Trùng lịch trực: Một bác sĩ không được phân lịch ở hai địa điểm hoặc hai phòng khám khác nhau trong cùng một ca trực.</w:t>
-      </w:r>
-    </w:p>
-    <w:p>
-      <w:pPr>
-        <w:rPr>
-          <w:rFonts w:ascii="Times New Roman" w:hAnsi="Times New Roman" w:cs="Times New Roman"/>
-          <w:color w:val="000000"/>
-          <w:sz w:val="26"/>
-        </w:rPr>
-      </w:pPr>
-      <w:r>
-        <w:rPr>
-          <w:rFonts w:ascii="Times New Roman" w:hAnsi="Times New Roman" w:cs="Times New Roman"/>
-          <w:color w:val="000000"/>
-          <w:sz w:val="26"/>
-        </w:rPr>
-        <w:t xml:space="preserve">   + Phù hợp chuyên môn: Phòng khám được phân lịch trực phải phù hợp với chuyên khoa của bác sĩ (Ví dụ: Bác sĩ thuộc khoa Tim Mạch chỉ được xếp lịch làm việc tại phòng khám Tim Mạch).</w:t>
-      </w:r>
-    </w:p>
-    <w:p>
-      <w:pPr>
-        <w:rPr>
-          <w:rFonts w:ascii="Times New Roman" w:hAnsi="Times New Roman" w:cs="Times New Roman"/>
-          <w:color w:val="000000"/>
-          <w:sz w:val="26"/>
-        </w:rPr>
-      </w:pPr>
-      <w:r>
-        <w:rPr>
-          <w:rFonts w:ascii="Times New Roman" w:hAnsi="Times New Roman" w:cs="Times New Roman"/>
-          <w:color w:val="000000"/>
-          <w:sz w:val="26"/>
-        </w:rPr>
-        <w:t xml:space="preserve">   + Chia ca làm việc: Lịch làm việc thường chia làm Ca Sáng (07:30 - 11:30) và Ca Chiều (13:30 - 17:00).</w:t>
+        <w:t>Bác sĩ trực tiếp đăng ký ca trực của mình trên hệ thống. Admin hoặc nhân sự quản lý sẽ giám sát tiến trình.</w:t>
+      </w:r>
+    </w:p>
+    <w:p>
+      <w:pPr>
+        <w:rPr>
+          <w:rFonts w:ascii="Times New Roman" w:hAnsi="Times New Roman" w:cs="Times New Roman"/>
+          <w:b/>
+          <w:color w:val="000000"/>
+          <w:sz w:val="26"/>
+        </w:rPr>
+      </w:pPr>
+      <w:r>
+        <w:rPr>
+          <w:rFonts w:ascii="Times New Roman" w:hAnsi="Times New Roman" w:cs="Times New Roman"/>
+          <w:b/>
+          <w:color w:val="000000"/>
+          <w:sz w:val="26"/>
+        </w:rPr>
+        <w:t xml:space="preserve"> - Quy tắc nghiệp vụ tự đăng ký (Self-Registration Rules):</w:t>
+      </w:r>
+    </w:p>
+    <w:p>
+      <w:pPr>
+        <w:rPr>
+          <w:rFonts w:ascii="Times New Roman" w:hAnsi="Times New Roman" w:cs="Times New Roman"/>
+          <w:color w:val="000000"/>
+          <w:sz w:val="26"/>
+        </w:rPr>
+      </w:pPr>
+      <w:r>
+        <w:rPr>
+          <w:rFonts w:ascii="Times New Roman" w:hAnsi="Times New Roman" w:cs="Times New Roman"/>
+          <w:color w:val="000000"/>
+          <w:sz w:val="26"/>
+        </w:rPr>
+        <w:t xml:space="preserve">   + Giới hạn số ca đăng ký: Mỗi bác sĩ chỉ được phép tự đăng ký tối đa 03 ca trực trong mỗi tuần để đảm bảo công bằng sức lao động.</w:t>
+      </w:r>
+    </w:p>
+    <w:p>
+      <w:pPr>
+        <w:rPr>
+          <w:rFonts w:ascii="Times New Roman" w:hAnsi="Times New Roman" w:cs="Times New Roman"/>
+          <w:color w:val="000000"/>
+          <w:sz w:val="26"/>
+        </w:rPr>
+      </w:pPr>
+      <w:r>
+        <w:rPr>
+          <w:rFonts w:ascii="Times New Roman" w:hAnsi="Times New Roman" w:cs="Times New Roman"/>
+          <w:color w:val="000000"/>
+          <w:sz w:val="26"/>
+        </w:rPr>
+        <w:t xml:space="preserve">   + Cập nhật thời gian thực: Khi một bác sĩ chọn ca trực, phòng khám và nhấn nút 'Lưu', thông tin này sẽ lập tức hiển thị công khai trên lịch trực chung của hệ thống. Những bác sĩ đăng ký sau sẽ thấy các ca trực đã có người chọn để chủ động đăng ký vào các ca trực/phòng khám còn trống khác.</w:t>
+      </w:r>
+    </w:p>
+    <w:p>
+      <w:pPr>
+        <w:rPr>
+          <w:rFonts w:ascii="Times New Roman" w:hAnsi="Times New Roman" w:cs="Times New Roman"/>
+          <w:color w:val="000000"/>
+          <w:sz w:val="26"/>
+        </w:rPr>
+      </w:pPr>
+      <w:r>
+        <w:rPr>
+          <w:rFonts w:ascii="Times New Roman" w:hAnsi="Times New Roman" w:cs="Times New Roman"/>
+          <w:color w:val="000000"/>
+          <w:sz w:val="26"/>
+        </w:rPr>
+        <w:t xml:space="preserve">   + Trùng lịch trực: Hệ thống chặn không cho một bác sĩ đăng ký 2 phòng khám khác nhau trong cùng một ca làm việc.</w:t>
+      </w:r>
+    </w:p>
+    <w:p>
+      <w:pPr>
+        <w:rPr>
+          <w:rFonts w:ascii="Times New Roman" w:hAnsi="Times New Roman" w:cs="Times New Roman"/>
+          <w:color w:val="000000"/>
+          <w:sz w:val="26"/>
+        </w:rPr>
+      </w:pPr>
+      <w:r>
+        <w:rPr>
+          <w:rFonts w:ascii="Times New Roman" w:hAnsi="Times New Roman" w:cs="Times New Roman"/>
+          <w:color w:val="000000"/>
+          <w:sz w:val="26"/>
+        </w:rPr>
+        <w:t xml:space="preserve">   + Phù hợp chuyên khoa: Bác sĩ chỉ được đăng ký trực tại các phòng khám thuộc chuyên khoa mình phụ trách.</w:t>
+      </w:r>
+    </w:p>
+    <w:p>
+      <w:pPr>
+        <w:rPr>
+          <w:rFonts w:ascii="Times New Roman" w:hAnsi="Times New Roman" w:cs="Times New Roman"/>
+          <w:color w:val="000000"/>
+          <w:sz w:val="26"/>
+        </w:rPr>
+      </w:pPr>
+      <w:r>
+        <w:rPr>
+          <w:rFonts w:ascii="Times New Roman" w:hAnsi="Times New Roman" w:cs="Times New Roman"/>
+          <w:color w:val="000000"/>
+          <w:sz w:val="26"/>
+        </w:rPr>
+        <w:t xml:space="preserve">   + Chia ca trực: Ca Sáng (07:30 - 11:30) và Ca Chiều (13:30 - 17:00).</w:t>
       </w:r>
     </w:p>
     <w:p>
@@ -954,6 +988,60 @@
           <w:sz w:val="26"/>
         </w:rPr>
         <w:t>Tại màn hình Tiếp đón bệnh nhân, lễ tân có thể tra cứu lịch hẹn đã xác nhận (DaXacNhan) dựa trên Số điện thoại của bệnh nhân. Khi người bệnh đến quầy, lễ tân chọn lịch hẹn tương ứng và nhấn nút 'Tiếp nhận'. Hệ thống sẽ tự động gọi API chuyển đổi thông tin bệnh nhân từ bảng DatLichKham sang bảng PhieuKham với trạng thái khám là '0' (Chờ khám) và tự động cập nhật trạng thái của DatLichKham thành 'DaTiepNhan' (Đã tiếp nhận), quy trình khép kín giúp tiết kiệm tối đa thời gian.</w:t>
+      </w:r>
+    </w:p>
+    <w:p>
+      <w:pPr>
+        <w:rPr>
+          <w:rFonts w:ascii="Times New Roman" w:hAnsi="Times New Roman" w:cs="Times New Roman"/>
+          <w:color w:val="000000"/>
+          <w:sz w:val="26"/>
+        </w:rPr>
+      </w:pPr>
+    </w:p>
+    <w:p>
+      <w:pPr>
+        <w:rPr>
+          <w:rFonts w:ascii="Times New Roman" w:hAnsi="Times New Roman" w:cs="Times New Roman"/>
+          <w:b/>
+          <w:color w:val="000000"/>
+          <w:sz w:val="26"/>
+        </w:rPr>
+      </w:pPr>
+      <w:r>
+        <w:rPr>
+          <w:rFonts w:ascii="Times New Roman" w:hAnsi="Times New Roman" w:cs="Times New Roman"/>
+          <w:b/>
+          <w:color w:val="000000"/>
+          <w:sz w:val="26"/>
+        </w:rPr>
+        <w:t>Câu 3: Làm thế nào hệ thống kiểm soát được giới hạn bác sĩ chỉ được đăng ký tối đa 03 ca trực một tuần?</w:t>
+      </w:r>
+    </w:p>
+    <w:p>
+      <w:pPr>
+        <w:rPr>
+          <w:rFonts w:ascii="Times New Roman" w:hAnsi="Times New Roman" w:cs="Times New Roman"/>
+          <w:color w:val="000000"/>
+          <w:sz w:val="26"/>
+        </w:rPr>
+      </w:pPr>
+      <w:r>
+        <w:rPr>
+          <w:rFonts w:ascii="Times New Roman" w:hAnsi="Times New Roman" w:cs="Times New Roman"/>
+          <w:b/>
+          <w:color w:val="0000FF"/>
+          <w:sz w:val="26"/>
+        </w:rPr>
+        <w:t xml:space="preserve">Trả lời: </w:t>
+      </w:r>
+      <w:r>
+        <w:rPr>
+          <w:rFonts w:ascii="Times New Roman" w:hAnsi="Times New Roman" w:cs="Times New Roman"/>
+          <w:color w:val="000000"/>
+          <w:sz w:val="26"/>
+        </w:rPr>
+        <w:t>Khi bác sĩ nhấn 'Lưu', Backend tiếp nhận request và thực hiện một truy vấn SQL đếm (COUNT) số bản ghi lịch trực của bác sĩ đó trong khoảng thời gian của tuần làm việc mong muốn. Nếu kết quả trả về đã đạt tới 3 ca trực, Backend sẽ từ chối lưu và trả về mã lỗi HTTP 400 Bad Request kèm thông báo chặn không cho đăng ký thêm. Trên giao diện Frontend, hệ thống cũng hiển thị trạng thái số lượng ca đã đăng ký trong tuần để bác sĩ theo dõi trực quan.</w:t>
       </w:r>
     </w:p>
     <w:p>
@@ -1383,7 +1471,7 @@
     <w:link w:val="Heading1Char"/>
     <w:uiPriority w:val="9"/>
     <w:qFormat/>
-    <w:rsid w:val="00EB5B1A"/>
+    <w:rsid w:val="00332A8A"/>
     <w:pPr>
       <w:keepNext/>
       <w:keepLines/>
@@ -1406,7 +1494,7 @@
     <w:semiHidden/>
     <w:unhideWhenUsed/>
     <w:qFormat/>
-    <w:rsid w:val="00EB5B1A"/>
+    <w:rsid w:val="00332A8A"/>
     <w:pPr>
       <w:keepNext/>
       <w:keepLines/>
@@ -1429,7 +1517,7 @@
     <w:semiHidden/>
     <w:unhideWhenUsed/>
     <w:qFormat/>
-    <w:rsid w:val="00EB5B1A"/>
+    <w:rsid w:val="00332A8A"/>
     <w:pPr>
       <w:keepNext/>
       <w:keepLines/>
@@ -1452,7 +1540,7 @@
     <w:semiHidden/>
     <w:unhideWhenUsed/>
     <w:qFormat/>
-    <w:rsid w:val="00EB5B1A"/>
+    <w:rsid w:val="00332A8A"/>
     <w:pPr>
       <w:keepNext/>
       <w:keepLines/>
@@ -1475,7 +1563,7 @@
     <w:semiHidden/>
     <w:unhideWhenUsed/>
     <w:qFormat/>
-    <w:rsid w:val="00EB5B1A"/>
+    <w:rsid w:val="00332A8A"/>
     <w:pPr>
       <w:keepNext/>
       <w:keepLines/>
@@ -1496,7 +1584,7 @@
     <w:semiHidden/>
     <w:unhideWhenUsed/>
     <w:qFormat/>
-    <w:rsid w:val="00EB5B1A"/>
+    <w:rsid w:val="00332A8A"/>
     <w:pPr>
       <w:keepNext/>
       <w:keepLines/>
@@ -1519,7 +1607,7 @@
     <w:semiHidden/>
     <w:unhideWhenUsed/>
     <w:qFormat/>
-    <w:rsid w:val="00EB5B1A"/>
+    <w:rsid w:val="00332A8A"/>
     <w:pPr>
       <w:keepNext/>
       <w:keepLines/>
@@ -1540,7 +1628,7 @@
     <w:semiHidden/>
     <w:unhideWhenUsed/>
     <w:qFormat/>
-    <w:rsid w:val="00EB5B1A"/>
+    <w:rsid w:val="00332A8A"/>
     <w:pPr>
       <w:keepNext/>
       <w:keepLines/>
@@ -1563,7 +1651,7 @@
     <w:semiHidden/>
     <w:unhideWhenUsed/>
     <w:qFormat/>
-    <w:rsid w:val="00EB5B1A"/>
+    <w:rsid w:val="00332A8A"/>
     <w:pPr>
       <w:keepNext/>
       <w:keepLines/>
@@ -1607,7 +1695,7 @@
     <w:basedOn w:val="DefaultParagraphFont"/>
     <w:link w:val="Heading1"/>
     <w:uiPriority w:val="9"/>
-    <w:rsid w:val="00EB5B1A"/>
+    <w:rsid w:val="00332A8A"/>
     <w:rPr>
       <w:rFonts w:asciiTheme="majorHAnsi" w:eastAsiaTheme="majorEastAsia" w:hAnsiTheme="majorHAnsi" w:cstheme="majorBidi"/>
       <w:color w:val="0F4761" w:themeColor="accent1" w:themeShade="BF"/>
@@ -1621,7 +1709,7 @@
     <w:link w:val="Heading2"/>
     <w:uiPriority w:val="9"/>
     <w:semiHidden/>
-    <w:rsid w:val="00EB5B1A"/>
+    <w:rsid w:val="00332A8A"/>
     <w:rPr>
       <w:rFonts w:asciiTheme="majorHAnsi" w:eastAsiaTheme="majorEastAsia" w:hAnsiTheme="majorHAnsi" w:cstheme="majorBidi"/>
       <w:color w:val="0F4761" w:themeColor="accent1" w:themeShade="BF"/>
@@ -1635,7 +1723,7 @@
     <w:link w:val="Heading3"/>
     <w:uiPriority w:val="9"/>
     <w:semiHidden/>
-    <w:rsid w:val="00EB5B1A"/>
+    <w:rsid w:val="00332A8A"/>
     <w:rPr>
       <w:rFonts w:eastAsiaTheme="majorEastAsia" w:cstheme="majorBidi"/>
       <w:color w:val="0F4761" w:themeColor="accent1" w:themeShade="BF"/>
@@ -1649,7 +1737,7 @@
     <w:link w:val="Heading4"/>
     <w:uiPriority w:val="9"/>
     <w:semiHidden/>
-    <w:rsid w:val="00EB5B1A"/>
+    <w:rsid w:val="00332A8A"/>
     <w:rPr>
       <w:rFonts w:eastAsiaTheme="majorEastAsia" w:cstheme="majorBidi"/>
       <w:i/>
@@ -1663,7 +1751,7 @@
     <w:link w:val="Heading5"/>
     <w:uiPriority w:val="9"/>
     <w:semiHidden/>
-    <w:rsid w:val="00EB5B1A"/>
+    <w:rsid w:val="00332A8A"/>
     <w:rPr>
       <w:rFonts w:eastAsiaTheme="majorEastAsia" w:cstheme="majorBidi"/>
       <w:color w:val="0F4761" w:themeColor="accent1" w:themeShade="BF"/>
@@ -1675,7 +1763,7 @@
     <w:link w:val="Heading6"/>
     <w:uiPriority w:val="9"/>
     <w:semiHidden/>
-    <w:rsid w:val="00EB5B1A"/>
+    <w:rsid w:val="00332A8A"/>
     <w:rPr>
       <w:rFonts w:eastAsiaTheme="majorEastAsia" w:cstheme="majorBidi"/>
       <w:i/>
@@ -1689,7 +1777,7 @@
     <w:link w:val="Heading7"/>
     <w:uiPriority w:val="9"/>
     <w:semiHidden/>
-    <w:rsid w:val="00EB5B1A"/>
+    <w:rsid w:val="00332A8A"/>
     <w:rPr>
       <w:rFonts w:eastAsiaTheme="majorEastAsia" w:cstheme="majorBidi"/>
       <w:color w:val="595959" w:themeColor="text1" w:themeTint="A6"/>
@@ -1701,7 +1789,7 @@
     <w:link w:val="Heading8"/>
     <w:uiPriority w:val="9"/>
     <w:semiHidden/>
-    <w:rsid w:val="00EB5B1A"/>
+    <w:rsid w:val="00332A8A"/>
     <w:rPr>
       <w:rFonts w:eastAsiaTheme="majorEastAsia" w:cstheme="majorBidi"/>
       <w:i/>
@@ -1715,7 +1803,7 @@
     <w:link w:val="Heading9"/>
     <w:uiPriority w:val="9"/>
     <w:semiHidden/>
-    <w:rsid w:val="00EB5B1A"/>
+    <w:rsid w:val="00332A8A"/>
     <w:rPr>
       <w:rFonts w:eastAsiaTheme="majorEastAsia" w:cstheme="majorBidi"/>
       <w:color w:val="272727" w:themeColor="text1" w:themeTint="D8"/>
@@ -1728,7 +1816,7 @@
     <w:link w:val="TitleChar"/>
     <w:uiPriority w:val="10"/>
     <w:qFormat/>
-    <w:rsid w:val="00EB5B1A"/>
+    <w:rsid w:val="00332A8A"/>
     <w:pPr>
       <w:spacing w:after="80" w:line="240" w:lineRule="auto"/>
       <w:contextualSpacing/>
@@ -1746,7 +1834,7 @@
     <w:basedOn w:val="DefaultParagraphFont"/>
     <w:link w:val="Title"/>
     <w:uiPriority w:val="10"/>
-    <w:rsid w:val="00EB5B1A"/>
+    <w:rsid w:val="00332A8A"/>
     <w:rPr>
       <w:rFonts w:asciiTheme="majorHAnsi" w:eastAsiaTheme="majorEastAsia" w:hAnsiTheme="majorHAnsi" w:cstheme="majorBidi"/>
       <w:spacing w:val="-10"/>
@@ -1762,7 +1850,7 @@
     <w:link w:val="SubtitleChar"/>
     <w:uiPriority w:val="11"/>
     <w:qFormat/>
-    <w:rsid w:val="00EB5B1A"/>
+    <w:rsid w:val="00332A8A"/>
     <w:pPr>
       <w:numPr>
         <w:ilvl w:val="1"/>
@@ -1781,7 +1869,7 @@
     <w:basedOn w:val="DefaultParagraphFont"/>
     <w:link w:val="Subtitle"/>
     <w:uiPriority w:val="11"/>
-    <w:rsid w:val="00EB5B1A"/>
+    <w:rsid w:val="00332A8A"/>
     <w:rPr>
       <w:rFonts w:eastAsiaTheme="majorEastAsia" w:cstheme="majorBidi"/>
       <w:color w:val="595959" w:themeColor="text1" w:themeTint="A6"/>
@@ -1797,7 +1885,7 @@
     <w:link w:val="QuoteChar"/>
     <w:uiPriority w:val="29"/>
     <w:qFormat/>
-    <w:rsid w:val="00EB5B1A"/>
+    <w:rsid w:val="00332A8A"/>
     <w:pPr>
       <w:spacing w:before="160"/>
       <w:jc w:val="center"/>
@@ -1813,7 +1901,7 @@
     <w:basedOn w:val="DefaultParagraphFont"/>
     <w:link w:val="Quote"/>
     <w:uiPriority w:val="29"/>
-    <w:rsid w:val="00EB5B1A"/>
+    <w:rsid w:val="00332A8A"/>
     <w:rPr>
       <w:i/>
       <w:iCs/>
@@ -1825,7 +1913,7 @@
     <w:basedOn w:val="Normal"/>
     <w:uiPriority w:val="34"/>
     <w:qFormat/>
-    <w:rsid w:val="00EB5B1A"/>
+    <w:rsid w:val="00332A8A"/>
     <w:pPr>
       <w:ind w:left="720"/>
       <w:contextualSpacing/>
@@ -1836,7 +1924,7 @@
     <w:basedOn w:val="DefaultParagraphFont"/>
     <w:uiPriority w:val="21"/>
     <w:qFormat/>
-    <w:rsid w:val="00EB5B1A"/>
+    <w:rsid w:val="00332A8A"/>
     <w:rPr>
       <w:i/>
       <w:iCs/>
@@ -1850,7 +1938,7 @@
     <w:link w:val="IntenseQuoteChar"/>
     <w:uiPriority w:val="30"/>
     <w:qFormat/>
-    <w:rsid w:val="00EB5B1A"/>
+    <w:rsid w:val="00332A8A"/>
     <w:pPr>
       <w:pBdr>
         <w:top w:val="single" w:sz="4" w:space="10" w:color="0F4761" w:themeColor="accent1" w:themeShade="BF"/>
@@ -1871,7 +1959,7 @@
     <w:basedOn w:val="DefaultParagraphFont"/>
     <w:link w:val="IntenseQuote"/>
     <w:uiPriority w:val="30"/>
-    <w:rsid w:val="00EB5B1A"/>
+    <w:rsid w:val="00332A8A"/>
     <w:rPr>
       <w:i/>
       <w:iCs/>
@@ -1883,7 +1971,7 @@
     <w:basedOn w:val="DefaultParagraphFont"/>
     <w:uiPriority w:val="32"/>
     <w:qFormat/>
-    <w:rsid w:val="00EB5B1A"/>
+    <w:rsid w:val="00332A8A"/>
     <w:rPr>
       <w:b/>
       <w:bCs/>

</xml_diff>

<commit_message>
fix: xoa nut them lich lam viec dung chung va noi rong chieu rong bang lich truc bac si
</commit_message>
<xml_diff>
--- a/NghiepVu_DatLich_PhanLich.docx
+++ b/NghiepVu_DatLich_PhanLich.docx
@@ -200,41 +200,72 @@
           <w:color w:val="000000"/>
           <w:sz w:val="26"/>
         </w:rPr>
-        <w:t xml:space="preserve">   + Cập nhật thời gian thực: Khi một bác sĩ chọn ca trực, phòng khám và nhấn nút 'Lưu', thông tin này sẽ lập tức hiển thị công khai trên lịch trực chung của hệ thống. Những bác sĩ đăng ký sau sẽ thấy các ca trực đã có người chọn để chủ động đăng ký vào các ca trực/phòng khám còn trống khác.</w:t>
-      </w:r>
-    </w:p>
-    <w:p>
-      <w:pPr>
-        <w:rPr>
-          <w:rFonts w:ascii="Times New Roman" w:hAnsi="Times New Roman" w:cs="Times New Roman"/>
-          <w:color w:val="000000"/>
-          <w:sz w:val="26"/>
-        </w:rPr>
-      </w:pPr>
-      <w:r>
-        <w:rPr>
-          <w:rFonts w:ascii="Times New Roman" w:hAnsi="Times New Roman" w:cs="Times New Roman"/>
-          <w:color w:val="000000"/>
-          <w:sz w:val="26"/>
-        </w:rPr>
-        <w:t xml:space="preserve">   + Trùng lịch trực: Hệ thống chặn không cho một bác sĩ đăng ký 2 phòng khám khác nhau trong cùng một ca làm việc.</w:t>
-      </w:r>
-    </w:p>
-    <w:p>
-      <w:pPr>
-        <w:rPr>
-          <w:rFonts w:ascii="Times New Roman" w:hAnsi="Times New Roman" w:cs="Times New Roman"/>
-          <w:color w:val="000000"/>
-          <w:sz w:val="26"/>
-        </w:rPr>
-      </w:pPr>
-      <w:r>
-        <w:rPr>
-          <w:rFonts w:ascii="Times New Roman" w:hAnsi="Times New Roman" w:cs="Times New Roman"/>
-          <w:color w:val="000000"/>
-          <w:sz w:val="26"/>
-        </w:rPr>
-        <w:t xml:space="preserve">   + Phù hợp chuyên khoa: Bác sĩ chỉ được đăng ký trực tại các phòng khám thuộc chuyên khoa mình phụ trách.</w:t>
+        <w:t xml:space="preserve">   + Cập nhật thời gian thực: Khi một bác sĩ chọn ca trực</w:t>
+      </w:r>
+      <w:r>
+        <w:rPr>
+          <w:rFonts w:ascii="Times New Roman" w:hAnsi="Times New Roman" w:cs="Times New Roman"/>
+          <w:color w:val="000000"/>
+          <w:sz w:val="26"/>
+        </w:rPr>
+        <w:t xml:space="preserve"> </w:t>
+      </w:r>
+      <w:r>
+        <w:rPr>
+          <w:rFonts w:ascii="Times New Roman" w:hAnsi="Times New Roman" w:cs="Times New Roman"/>
+          <w:color w:val="000000"/>
+          <w:sz w:val="26"/>
+        </w:rPr>
+        <w:t>và nhấn nút 'Lưu', thông tin này sẽ lập tức hiển thị công khai trên lịch trực chung của hệ thống. Những bác sĩ đăng ký sau sẽ thấy các ca trực đã có người chọn để chủ động đăng ký vào các ca trực/phòng khám còn trống khác.</w:t>
+      </w:r>
+    </w:p>
+    <w:p>
+      <w:pPr>
+        <w:rPr>
+          <w:rFonts w:ascii="Times New Roman" w:hAnsi="Times New Roman" w:cs="Times New Roman"/>
+          <w:color w:val="000000"/>
+          <w:sz w:val="26"/>
+        </w:rPr>
+      </w:pPr>
+      <w:r>
+        <w:rPr>
+          <w:rFonts w:ascii="Times New Roman" w:hAnsi="Times New Roman" w:cs="Times New Roman"/>
+          <w:color w:val="000000"/>
+          <w:sz w:val="26"/>
+        </w:rPr>
+        <w:t xml:space="preserve">   + Trùng lịch trực: Hệ thống chặn không cho</w:t>
+      </w:r>
+      <w:r>
+        <w:rPr>
+          <w:rFonts w:ascii="Times New Roman" w:hAnsi="Times New Roman" w:cs="Times New Roman"/>
+          <w:color w:val="000000"/>
+          <w:sz w:val="26"/>
+        </w:rPr>
+        <w:t xml:space="preserve"> 2 bác sĩ </w:t>
+      </w:r>
+      <w:r>
+        <w:rPr>
+          <w:rFonts w:ascii="Times New Roman" w:hAnsi="Times New Roman" w:cs="Times New Roman"/>
+          <w:color w:val="EE0000"/>
+          <w:sz w:val="26"/>
+        </w:rPr>
+        <w:t xml:space="preserve">CÙNG KHOA </w:t>
+      </w:r>
+      <w:r>
+        <w:rPr>
+          <w:rFonts w:ascii="Times New Roman" w:hAnsi="Times New Roman" w:cs="Times New Roman"/>
+          <w:color w:val="000000"/>
+          <w:sz w:val="26"/>
+        </w:rPr>
+        <w:t>đăng kí chung 1 ca trực</w:t>
+      </w:r>
+      <w:r>
+        <w:rPr>
+          <w:rFonts w:ascii="Times New Roman" w:hAnsi="Times New Roman" w:cs="Times New Roman"/>
+          <w:color w:val="000000"/>
+          <w:sz w:val="26"/>
+        </w:rPr>
+        <w:t>.</w:t>
       </w:r>
     </w:p>
     <w:p>
@@ -341,6 +372,7 @@
           <w:color w:val="000000"/>
           <w:sz w:val="26"/>
         </w:rPr>
+        <w:lastRenderedPageBreak/>
         <w:t xml:space="preserve">   + Bước 1 (Lựa chọn thông tin): Khách truy cập cổng đặt lịch, chọn Ngày hẹn mong muốn và Chuyên khoa cần khám. Hệ thống tự động truy vấn dữ liệu từ bảng lịch trực bác sĩ và hiển thị danh sách các bác sĩ có ca trực trống trong ngày đó.</w:t>
       </w:r>
     </w:p>
@@ -703,6 +735,7 @@
           <w:color w:val="000000"/>
           <w:sz w:val="26"/>
         </w:rPr>
+        <w:lastRenderedPageBreak/>
         <w:t xml:space="preserve"> - SDT (varchar(15)): </w:t>
       </w:r>
       <w:r>
@@ -842,206 +875,6 @@
           <w:sz w:val="26"/>
         </w:rPr>
         <w:t>Ca hẹn cụ thể (N'Sáng' hoặc N'Chiều').</w:t>
-      </w:r>
-    </w:p>
-    <w:p>
-      <w:pPr>
-        <w:rPr>
-          <w:rFonts w:ascii="Times New Roman" w:hAnsi="Times New Roman" w:cs="Times New Roman"/>
-          <w:color w:val="000000"/>
-          <w:sz w:val="26"/>
-        </w:rPr>
-      </w:pPr>
-    </w:p>
-    <w:p>
-      <w:pPr>
-        <w:rPr>
-          <w:rFonts w:ascii="Times New Roman" w:hAnsi="Times New Roman" w:cs="Times New Roman"/>
-          <w:color w:val="000000"/>
-          <w:sz w:val="26"/>
-        </w:rPr>
-      </w:pPr>
-    </w:p>
-    <w:p>
-      <w:pPr>
-        <w:rPr>
-          <w:rFonts w:ascii="Times New Roman" w:hAnsi="Times New Roman" w:cs="Times New Roman"/>
-          <w:b/>
-          <w:color w:val="000000"/>
-          <w:sz w:val="28"/>
-        </w:rPr>
-      </w:pPr>
-      <w:r>
-        <w:rPr>
-          <w:rFonts w:ascii="Times New Roman" w:hAnsi="Times New Roman" w:cs="Times New Roman"/>
-          <w:b/>
-          <w:color w:val="000000"/>
-          <w:sz w:val="28"/>
-        </w:rPr>
-        <w:t>PHẦN III: CÁC CÂU HỎI THƯỜNG GẶP KHI BẢO VỆ LUẬN VĂN &amp; CÁCH TRẢ LỜI</w:t>
-      </w:r>
-    </w:p>
-    <w:p>
-      <w:pPr>
-        <w:rPr>
-          <w:rFonts w:ascii="Times New Roman" w:hAnsi="Times New Roman" w:cs="Times New Roman"/>
-          <w:b/>
-          <w:color w:val="000000"/>
-          <w:sz w:val="28"/>
-        </w:rPr>
-      </w:pPr>
-    </w:p>
-    <w:p>
-      <w:pPr>
-        <w:rPr>
-          <w:rFonts w:ascii="Times New Roman" w:hAnsi="Times New Roman" w:cs="Times New Roman"/>
-          <w:b/>
-          <w:color w:val="000000"/>
-          <w:sz w:val="26"/>
-        </w:rPr>
-      </w:pPr>
-      <w:r>
-        <w:rPr>
-          <w:rFonts w:ascii="Times New Roman" w:hAnsi="Times New Roman" w:cs="Times New Roman"/>
-          <w:b/>
-          <w:color w:val="000000"/>
-          <w:sz w:val="26"/>
-        </w:rPr>
-        <w:t>Câu 1: Làm sao em đảm bảo tính toàn vẹn dữ liệu và tránh tình trạng phân trùng ca trực cho bác sĩ?</w:t>
-      </w:r>
-    </w:p>
-    <w:p>
-      <w:pPr>
-        <w:rPr>
-          <w:rFonts w:ascii="Times New Roman" w:hAnsi="Times New Roman" w:cs="Times New Roman"/>
-          <w:color w:val="000000"/>
-          <w:sz w:val="26"/>
-        </w:rPr>
-      </w:pPr>
-      <w:r>
-        <w:rPr>
-          <w:rFonts w:ascii="Times New Roman" w:hAnsi="Times New Roman" w:cs="Times New Roman"/>
-          <w:b/>
-          <w:color w:val="0000FF"/>
-          <w:sz w:val="26"/>
-        </w:rPr>
-        <w:t xml:space="preserve">Trả lời: </w:t>
-      </w:r>
-      <w:r>
-        <w:rPr>
-          <w:rFonts w:ascii="Times New Roman" w:hAnsi="Times New Roman" w:cs="Times New Roman"/>
-          <w:color w:val="000000"/>
-          <w:sz w:val="26"/>
-        </w:rPr>
-        <w:t>Để ngăn chặn trùng lịch trực, em thiết lập ràng buộc UNIQUE CONSTRAINT trên bộ ba trường (MaNV, NgayLamViec, CaLamViec) trong bảng LichLamViec của cơ sở dữ liệu SQL Server. Ở tầng Backend/Frontend, trước khi tiến hành lưu ca trực mới, hệ thống sẽ thực hiện kiểm tra: nếu bác sĩ đã được phân lịch trực vào ngày và ca đó thì hệ thống sẽ từ chối và cảnh báo lỗi ra màn hình.</w:t>
-      </w:r>
-    </w:p>
-    <w:p>
-      <w:pPr>
-        <w:rPr>
-          <w:rFonts w:ascii="Times New Roman" w:hAnsi="Times New Roman" w:cs="Times New Roman"/>
-          <w:color w:val="000000"/>
-          <w:sz w:val="26"/>
-        </w:rPr>
-      </w:pPr>
-    </w:p>
-    <w:p>
-      <w:pPr>
-        <w:rPr>
-          <w:rFonts w:ascii="Times New Roman" w:hAnsi="Times New Roman" w:cs="Times New Roman"/>
-          <w:b/>
-          <w:color w:val="000000"/>
-          <w:sz w:val="26"/>
-        </w:rPr>
-      </w:pPr>
-      <w:r>
-        <w:rPr>
-          <w:rFonts w:ascii="Times New Roman" w:hAnsi="Times New Roman" w:cs="Times New Roman"/>
-          <w:b/>
-          <w:color w:val="000000"/>
-          <w:sz w:val="26"/>
-        </w:rPr>
-        <w:t>Câu 2: Cơ chế liên thông dữ liệu từ Đặt lịch khám sang Tiếp đón bệnh nhân hoạt động ra sao?</w:t>
-      </w:r>
-    </w:p>
-    <w:p>
-      <w:pPr>
-        <w:rPr>
-          <w:rFonts w:ascii="Times New Roman" w:hAnsi="Times New Roman" w:cs="Times New Roman"/>
-          <w:color w:val="000000"/>
-          <w:sz w:val="26"/>
-        </w:rPr>
-      </w:pPr>
-      <w:r>
-        <w:rPr>
-          <w:rFonts w:ascii="Times New Roman" w:hAnsi="Times New Roman" w:cs="Times New Roman"/>
-          <w:b/>
-          <w:color w:val="0000FF"/>
-          <w:sz w:val="26"/>
-        </w:rPr>
-        <w:t xml:space="preserve">Trả lời: </w:t>
-      </w:r>
-      <w:r>
-        <w:rPr>
-          <w:rFonts w:ascii="Times New Roman" w:hAnsi="Times New Roman" w:cs="Times New Roman"/>
-          <w:color w:val="000000"/>
-          <w:sz w:val="26"/>
-        </w:rPr>
-        <w:t>Tại màn hình Tiếp đón bệnh nhân, lễ tân có thể tra cứu lịch hẹn đã xác nhận (DaXacNhan) dựa trên Số điện thoại của bệnh nhân. Khi người bệnh đến quầy, lễ tân chọn lịch hẹn tương ứng và nhấn nút 'Tiếp nhận'. Hệ thống sẽ tự động gọi API chuyển đổi thông tin bệnh nhân từ bảng DatLichKham sang bảng PhieuKham với trạng thái khám là '0' (Chờ khám) và tự động cập nhật trạng thái của DatLichKham thành 'DaTiepNhan' (Đã tiếp nhận), quy trình khép kín giúp tiết kiệm tối đa thời gian.</w:t>
-      </w:r>
-    </w:p>
-    <w:p>
-      <w:pPr>
-        <w:rPr>
-          <w:rFonts w:ascii="Times New Roman" w:hAnsi="Times New Roman" w:cs="Times New Roman"/>
-          <w:color w:val="000000"/>
-          <w:sz w:val="26"/>
-        </w:rPr>
-      </w:pPr>
-    </w:p>
-    <w:p>
-      <w:pPr>
-        <w:rPr>
-          <w:rFonts w:ascii="Times New Roman" w:hAnsi="Times New Roman" w:cs="Times New Roman"/>
-          <w:b/>
-          <w:color w:val="000000"/>
-          <w:sz w:val="26"/>
-        </w:rPr>
-      </w:pPr>
-      <w:r>
-        <w:rPr>
-          <w:rFonts w:ascii="Times New Roman" w:hAnsi="Times New Roman" w:cs="Times New Roman"/>
-          <w:b/>
-          <w:color w:val="000000"/>
-          <w:sz w:val="26"/>
-        </w:rPr>
-        <w:t>Câu 3: Làm thế nào hệ thống kiểm soát được giới hạn bác sĩ chỉ được đăng ký tối đa 03 ca trực một tuần?</w:t>
-      </w:r>
-    </w:p>
-    <w:p>
-      <w:pPr>
-        <w:rPr>
-          <w:rFonts w:ascii="Times New Roman" w:hAnsi="Times New Roman" w:cs="Times New Roman"/>
-          <w:color w:val="000000"/>
-          <w:sz w:val="26"/>
-        </w:rPr>
-      </w:pPr>
-      <w:r>
-        <w:rPr>
-          <w:rFonts w:ascii="Times New Roman" w:hAnsi="Times New Roman" w:cs="Times New Roman"/>
-          <w:b/>
-          <w:color w:val="0000FF"/>
-          <w:sz w:val="26"/>
-        </w:rPr>
-        <w:t xml:space="preserve">Trả lời: </w:t>
-      </w:r>
-      <w:r>
-        <w:rPr>
-          <w:rFonts w:ascii="Times New Roman" w:hAnsi="Times New Roman" w:cs="Times New Roman"/>
-          <w:color w:val="000000"/>
-          <w:sz w:val="26"/>
-        </w:rPr>
-        <w:t>Khi bác sĩ nhấn 'Lưu', Backend tiếp nhận request và thực hiện một truy vấn SQL đếm (COUNT) số bản ghi lịch trực của bác sĩ đó trong khoảng thời gian của tuần làm việc mong muốn. Nếu kết quả trả về đã đạt tới 3 ca trực, Backend sẽ từ chối lưu và trả về mã lỗi HTTP 400 Bad Request kèm thông báo chặn không cho đăng ký thêm. Trên giao diện Frontend, hệ thống cũng hiển thị trạng thái số lượng ca đã đăng ký trong tuần để bác sĩ theo dõi trực quan.</w:t>
       </w:r>
     </w:p>
     <w:p>

</xml_diff>